<commit_message>
Actualiza manual con operacion productiva real
</commit_message>
<xml_diff>
--- a/docs/Manual_Steps_Tracker.docx
+++ b/docs/Manual_Steps_Tracker.docx
@@ -871,7 +871,7 @@
           <w:color w:val="5B6E68"/>
           <w:sz w:val="24"/>
         </w:rPr>
-        <w:t>Es la primera lectura para un encargado o jefe. Muestra el estado general sin exigir revisar pantalla por pantalla.</w:t>
+        <w:t>Es la primera lectura para un encargado o jefe. En datos reales muestra máquinas, sesiones abiertas, horas productivas, distancia GPS, combustible estimado y la calidad de los registros visibles para el usuario.</w:t>
       </w:r>
     </w:p>
     <w:p>
@@ -940,11 +940,9 @@
         <w:rPr>
           <w:b/>
         </w:rPr>
-        <w:t xml:space="preserve">1. </w:t>
+        <w:t>1. Revise las tarjetas superiores: máquinas, sesiones abiertas, horas, distancia GPS y combustible estimado.</w:t>
       </w:r>
-      <w:r>
-        <w:t>Revise las tarjetas superiores: máquinas trabajando, superficie, distancia y consumo.</w:t>
-      </w:r>
+      <w:r/>
     </w:p>
     <w:p>
       <w:pPr>
@@ -955,11 +953,9 @@
         <w:rPr>
           <w:b/>
         </w:rPr>
-        <w:t xml:space="preserve">2. </w:t>
+        <w:t>2. Revise la actividad reciente. Si aparece “Pendiente cierre”, la sesión lleva más de 24 horas abierta y no se suma a horas ni combustible productivo.</w:t>
       </w:r>
-      <w:r>
-        <w:t>Lea ‘Atención requerida’ para detectar combustible bajo u otra situación pendiente.</w:t>
-      </w:r>
+      <w:r/>
     </w:p>
     <w:p>
       <w:pPr>
@@ -970,11 +966,9 @@
         <w:rPr>
           <w:b/>
         </w:rPr>
-        <w:t xml:space="preserve">3. </w:t>
+        <w:t>3. Observe el índice de integridad: combina sesiones cerradas, presencia de GPS y asignación de labor y centro de costo.</w:t>
       </w:r>
-      <w:r>
-        <w:t>Seleccione una ubicación para enfocar el mapa y la flota de ese fundo.</w:t>
-      </w:r>
+      <w:r/>
     </w:p>
     <w:p>
       <w:pPr>
@@ -985,11 +979,9 @@
         <w:rPr>
           <w:b/>
         </w:rPr>
-        <w:t xml:space="preserve">4. </w:t>
+        <w:t>4. Use Demo para explicar un escenario completo y Datos reales para revisar la operación autorizada.</w:t>
       </w:r>
-      <w:r>
-        <w:t>Use la actividad reciente para comprender los últimos eventos.</w:t>
-      </w:r>
+      <w:r/>
     </w:p>
     <w:p>
       <w:r>
@@ -1186,7 +1178,7 @@
               <w:spacing w:after="0"/>
             </w:pPr>
             <w:r>
-              <w:t>Una sesión que queda abierta puede aparecer como activa y afectar el porcentaje de cierre. Conviene revisar este punto al terminar la jornada.</w:t>
+              <w:t>Una sesión abierta por más de 24 horas se marca como pendiente de cierre. Sigue en el historial y conserva su GPS, pero no suma horas ni combustible productivo hasta ser revisada.</w:t>
             </w:r>
           </w:p>
         </w:tc>
@@ -1398,7 +1390,7 @@
           <w:color w:val="5B6E68"/>
           <w:sz w:val="24"/>
         </w:rPr>
-        <w:t>Permite observar máquinas, ubicaciones y estados en un mapa. Es útil para coordinación, seguridad y seguimiento de la jornada.</w:t>
+        <w:t>En Datos reales muestra los polígonos registrados y ubica solamente sesiones abiertas durante las últimas 24 horas que tengan posición GPS. Las sesiones antiguas quedan como “Cierre pendiente” y no se presentan como máquinas activas.</w:t>
       </w:r>
     </w:p>
     <w:p>
@@ -1548,7 +1540,7 @@
               <w:spacing w:after="0"/>
             </w:pPr>
             <w:r>
-              <w:t>La posición sirve como apoyo operacional. Antes de concluir que existe un problema, confirme señal, hora de la última actualización y contexto del trabajo.</w:t>
+              <w:t>Una máquina aparece en el mapa real sólo si tiene una sesión abierta reciente y una posición GPS. Si no aparece, revise la hora del último punto, la señal y el estado de cierre.</w:t>
             </w:r>
           </w:p>
         </w:tc>
@@ -1589,7 +1581,7 @@
           <w:color w:val="5B6E68"/>
           <w:sz w:val="24"/>
         </w:rPr>
-        <w:t>Ayuda a comparar distancia y uso acumulado por equipo. Es una base útil para planificar servicios, revisar desvíos y respaldar costos.</w:t>
+        <w:t>Compara por máquina el odómetro GPS, las horas registradas, el combustible estimado y la cantidad de puntos. Las sesiones abiertas por más de 24 horas se mantienen visibles, pero no inflan horas ni combustible.</w:t>
       </w:r>
     </w:p>
     <w:p>
@@ -1703,7 +1695,7 @@
           <w:color w:val="5B6E68"/>
           <w:sz w:val="24"/>
         </w:rPr>
-        <w:t>Resume los resultados más importantes y permite conversar sobre avance, productividad y consumo sin entrar todavía al detalle de cada sesión.</w:t>
+        <w:t>Resume resultados reales y calidad de información. El índice de integridad muestra cierre de sesiones, cobertura GPS y clasificación por labor y centro de costo; además compara horas, distancia, consumo horario y sesiones abiertas.</w:t>
       </w:r>
     </w:p>
     <w:p>
@@ -1793,7 +1785,7 @@
               <w:spacing w:after="0"/>
             </w:pPr>
             <w:r>
-              <w:t>Un indicador no es una sentencia. Si cambia mucho, abra Analítica o Historial y busque la causa: labor, terreno, máquina, operador, clima o calidad del registro.</w:t>
+              <w:t>El índice de integridad no califica a una persona. Señala si falta cerrar sesiones, capturar GPS o asignar labor y centro de costo para que los reportes sean comparables.</w:t>
             </w:r>
           </w:p>
         </w:tc>
@@ -1834,7 +1826,7 @@
           <w:color w:val="5B6E68"/>
           <w:sz w:val="24"/>
         </w:rPr>
-        <w:t>Analítica transforma sesiones individuales en tendencias y comparaciones. Se puede filtrar por toda la empresa o por una ubicación, y por 7 días, 30 días o todo el histórico.</w:t>
+        <w:t>Analítica transforma sesiones individuales en tendencias y comparaciones. En Datos reales usa sesiones, GPS, máquinas, labores y centros de costo; permite revisar 7 días, 30 días o todo el histórico cargado y exportar el detalle a CSV.</w:t>
       </w:r>
     </w:p>
     <w:p>
@@ -1953,7 +1945,7 @@
               <w:rPr>
                 <w:b/>
               </w:rPr>
-              <w:t>Superficie</w:t>
+              <w:t>Horas registradas</w:t>
             </w:r>
           </w:p>
         </w:tc>
@@ -1970,7 +1962,7 @@
           </w:tcPr>
           <w:p>
             <w:r>
-              <w:t>Hectáreas cubiertas dentro del alcance y período.</w:t>
+              <w:t>Duración efectiva; excluye sesiones abiertas por más de 24 horas.</w:t>
             </w:r>
           </w:p>
         </w:tc>
@@ -1995,7 +1987,7 @@
               <w:rPr>
                 <w:b/>
               </w:rPr>
-              <w:t>Productividad</w:t>
+              <w:t>Distancia GPS</w:t>
             </w:r>
           </w:p>
         </w:tc>
@@ -2012,7 +2004,7 @@
           </w:tcPr>
           <w:p>
             <w:r>
-              <w:t>Hectáreas realizadas por hora efectiva.</w:t>
+              <w:t>Suma del recorrido almacenado por máquina o período.</w:t>
             </w:r>
           </w:p>
         </w:tc>
@@ -2037,7 +2029,7 @@
               <w:rPr>
                 <w:b/>
               </w:rPr>
-              <w:t>Consumo específico</w:t>
+              <w:t>Consumo horario</w:t>
             </w:r>
           </w:p>
         </w:tc>
@@ -2054,7 +2046,7 @@
           </w:tcPr>
           <w:p>
             <w:r>
-              <w:t>Litros utilizados por hectárea.</w:t>
+              <w:t>Litros estimados por hora según configuración de máquina y labor.</w:t>
             </w:r>
           </w:p>
         </w:tc>
@@ -2079,7 +2071,7 @@
               <w:rPr>
                 <w:b/>
               </w:rPr>
-              <w:t>Cierre</w:t>
+              <w:t>Integridad</w:t>
             </w:r>
           </w:p>
         </w:tc>
@@ -2096,7 +2088,7 @@
           </w:tcPr>
           <w:p>
             <w:r>
-              <w:t>Porcentaje de sesiones correctamente terminadas.</w:t>
+              <w:t>Promedio de cierre, cobertura GPS y clasificación completa.</w:t>
             </w:r>
           </w:p>
         </w:tc>
@@ -2276,7 +2268,7 @@
               <w:spacing w:after="0"/>
             </w:pPr>
             <w:r>
-              <w:t>No pregunte solamente ‘¿quién consumió más?’. Compare litros por hectárea, tipo de labor, superficie, terreno y horas antes de tomar una decisión.</w:t>
+              <w:t>No pregunte solamente “¿quién consumió más?”. Compare horas, distancia, consumo horario, labor, terreno y calidad del registro antes de decidir.</w:t>
             </w:r>
           </w:p>
         </w:tc>
@@ -2456,7 +2448,7 @@
               <w:spacing w:after="0"/>
             </w:pPr>
             <w:r>
-              <w:t>Use el reporte atractivo para descubrir una situación; use Detalle e Historial para comprobarla y explicarla.</w:t>
+              <w:t>Use Analítica para descubrir una situación; use Detalle, Historial y reproducción GPS para comprobarla. Los datos Demo y reales siempre se mantienen separados.</w:t>
             </w:r>
           </w:p>
         </w:tc>
@@ -2497,7 +2489,7 @@
           <w:color w:val="5B6E68"/>
           <w:sz w:val="24"/>
         </w:rPr>
-        <w:t>Los maestros evitan escribir nombres distintos para la misma cosa. Aquí se administran predios, polígonos, actividades, labores, implementos, máquinas y otros datos reutilizables.</w:t>
+        <w:t>Los maestros evitan escribir nombres distintos para la misma cosa. Todos los usuarios autenticados pueden consultarlos, pero sólo un administrador puede crear, editar o eliminar predios, polígonos, actividades, labores, implementos, máquinas y demás catálogos.</w:t>
       </w:r>
     </w:p>
     <w:p>
@@ -2894,7 +2886,7 @@
           <w:color w:val="5B6E68"/>
           <w:sz w:val="24"/>
         </w:rPr>
-        <w:t>Historial sirve para consultar registros ya creados. Desde allí se puede abrir una sesión y reproducir su recorrido sobre el mapa.</w:t>
+        <w:t>Historial sirve para consultar registros ya creados. Las sesiones reales pueden abrirse para cargar sus puntos GPS, reproducir el recorrido sobre el mapa y revisar velocidad y posición a lo largo del tiempo.</w:t>
       </w:r>
     </w:p>
     <w:p>
@@ -3044,7 +3036,7 @@
               <w:spacing w:after="0"/>
             </w:pPr>
             <w:r>
-              <w:t>Ingreso manual crea registros. Historial busca, revisa y reproduce registros que ya existen.</w:t>
+              <w:t>Ingreso manual crea partes revisados. Historial consulta y reproduce registros existentes. Maestros configura catálogos y sólo permite cambios a administradores.</w:t>
             </w:r>
           </w:p>
         </w:tc>
@@ -3422,7 +3414,7 @@
         <w:pStyle w:val="ListBullet"/>
       </w:pPr>
       <w:r>
-        <w:t>Administrador: mantener maestros y permisos.</w:t>
+        <w:t>Administrador: mantener maestros y permisos; los demás perfiles pueden consultar los catálogos y operar sólo sobre sus centros de costo autorizados.</w:t>
       </w:r>
     </w:p>
     <w:p>
@@ -3513,11 +3505,9 @@
         <w:rPr>
           <w:b/>
         </w:rPr>
-        <w:t xml:space="preserve">3. </w:t>
+        <w:t>3. Visibilidad: abra Monitoreo y Resumen; cambie a Datos reales para mostrar polígonos, sesiones y alertas de cierre sin mezclar el laboratorio.</w:t>
       </w:r>
-      <w:r>
-        <w:t>Visibilidad: abra Monitoreo y Resumen para enseñar la operación y las alertas.</w:t>
-      </w:r>
+      <w:r/>
     </w:p>
     <w:p>
       <w:pPr>
@@ -3528,11 +3518,9 @@
         <w:rPr>
           <w:b/>
         </w:rPr>
-        <w:t xml:space="preserve">4. </w:t>
+        <w:t>4. Decisión: entre a Indicadores y Analítica para explicar integridad, horas, distancia, combustible, tendencias y uso de flota.</w:t>
       </w:r>
-      <w:r>
-        <w:t>Decisión: entre a Analítica, cambie de reporte y explique productividad, combustible y uso de flota.</w:t>
-      </w:r>
+      <w:r/>
     </w:p>
     <w:p>
       <w:pPr>
@@ -3543,11 +3531,9 @@
         <w:rPr>
           <w:b/>
         </w:rPr>
-        <w:t xml:space="preserve">5. </w:t>
+        <w:t>5. Respaldo: cierre con Detalle, reproducción GPS, maestros protegidos e integración activa con Odoo.</w:t>
       </w:r>
-      <w:r>
-        <w:t>Respaldo: cierre con Detalle, Historial, maestros e integración con Odoo.</w:t>
-      </w:r>
+      <w:r/>
     </w:p>
     <w:p>
       <w:pPr>
@@ -3889,7 +3875,7 @@
           </w:tcPr>
           <w:p>
             <w:r>
-              <w:t>Aparecerá activa hasta cerrarse o corregirse; conviene revisarla al terminar la jornada.</w:t>
+              <w:t>Si supera 24 horas se marca “Pendiente cierre” y deja de sumar horas y combustible productivo, pero no se borra ni pierde su GPS.</w:t>
             </w:r>
           </w:p>
         </w:tc>
@@ -3973,7 +3959,7 @@
           </w:tcPr>
           <w:p>
             <w:r>
-              <w:t>La solución contempla modelos, sincronización y endpoints compatibles; al desplegar se deben activar y validar en el servidor.</w:t>
+              <w:t>Sí. La aplicación step_hr está activa en Odoo y sincroniza máquinas, predios, sesiones y partes mediante la API de Tracker.</w:t>
             </w:r>
           </w:p>
         </w:tc>
@@ -4016,6 +4002,28 @@
           <w:p>
             <w:r>
               <w:t>No. El modo demo indica que usa datos sintéticos y no escribe en producción.</w:t>
+            </w:r>
+          </w:p>
+        </w:tc>
+      </w:tr>
+      <w:tr>
+        <w:tc>
+          <w:tcPr>
+            <w:tcW w:type="dxa" w:w="2952"/>
+          </w:tcPr>
+          <w:p>
+            <w:r>
+              <w:t>¿Quién puede modificar los maestros?</w:t>
+            </w:r>
+          </w:p>
+        </w:tc>
+        <w:tc>
+          <w:tcPr>
+            <w:tcW w:type="dxa" w:w="6408"/>
+          </w:tcPr>
+          <w:p>
+            <w:r>
+              <w:t>Sólo un administrador. Los usuarios autenticados pueden consultar catálogos y trabajar dentro de sus centros de costo autorizados.</w:t>
             </w:r>
           </w:p>
         </w:tc>
@@ -4217,7 +4225,7 @@
         <w:pStyle w:val="ListBullet"/>
       </w:pPr>
       <w:r>
-        <w:t>Aclare qué está listo, qué usa datos demo y qué se activará al desplegar backend y Odoo.</w:t>
+        <w:t>Aclare cuándo está usando Demo y cuándo Datos reales. Confirme que la API y la aplicación de Odoo están disponibles antes de una demostración productiva.</w:t>
       </w:r>
     </w:p>
     <w:p/>

</xml_diff>

<commit_message>
Corrige compatibilidad del manual con Word web
</commit_message>
<xml_diff>
--- a/docs/Manual_Steps_Tracker.docx
+++ b/docs/Manual_Steps_Tracker.docx
@@ -181,7 +181,7 @@
     </w:p>
     <w:p>
       <w:pPr>
-        <w:pStyle w:val="Heading1"/>
+        <w:pStyle w:val="SectionTitleManual"/>
       </w:pPr>
       <w:r>
         <w:t>1. Qué es Steps Tracker</w:t>
@@ -343,7 +343,7 @@
     </w:p>
     <w:p>
       <w:pPr>
-        <w:pStyle w:val="Heading1"/>
+        <w:pStyle w:val="SectionTitleManual"/>
       </w:pPr>
       <w:r>
         <w:t>2. Cómo está organizada la plataforma</w:t>
@@ -856,7 +856,7 @@
     </w:p>
     <w:p>
       <w:pPr>
-        <w:pStyle w:val="Heading1"/>
+        <w:pStyle w:val="SectionTitleManual"/>
       </w:pPr>
       <w:r>
         <w:t>3. Resumen de jornada</w:t>
@@ -998,7 +998,7 @@
     </w:p>
     <w:p>
       <w:pPr>
-        <w:pStyle w:val="Heading1"/>
+        <w:pStyle w:val="SectionTitleManual"/>
       </w:pPr>
       <w:r>
         <w:t>4. Registro de una labor con GPS</w:t>
@@ -1204,7 +1204,7 @@
     </w:p>
     <w:p>
       <w:pPr>
-        <w:pStyle w:val="Heading1"/>
+        <w:pStyle w:val="SectionTitleManual"/>
       </w:pPr>
       <w:r>
         <w:t>5. Ingreso manual de información</w:t>
@@ -1375,7 +1375,7 @@
     </w:p>
     <w:p>
       <w:pPr>
-        <w:pStyle w:val="Heading1"/>
+        <w:pStyle w:val="SectionTitleManual"/>
       </w:pPr>
       <w:r>
         <w:t>6. Monitoreo de flota</w:t>
@@ -1566,7 +1566,7 @@
     </w:p>
     <w:p>
       <w:pPr>
-        <w:pStyle w:val="Heading1"/>
+        <w:pStyle w:val="SectionTitleManual"/>
       </w:pPr>
       <w:r>
         <w:t>7. Odómetro y mantenimiento</w:t>
@@ -1680,7 +1680,7 @@
     </w:p>
     <w:p>
       <w:pPr>
-        <w:pStyle w:val="Heading1"/>
+        <w:pStyle w:val="SectionTitleManual"/>
       </w:pPr>
       <w:r>
         <w:t>8. Indicadores principales</w:t>
@@ -1811,7 +1811,7 @@
     </w:p>
     <w:p>
       <w:pPr>
-        <w:pStyle w:val="Heading1"/>
+        <w:pStyle w:val="SectionTitleManual"/>
       </w:pPr>
       <w:r>
         <w:t>9. Analítica: una visión para decidir</w:t>
@@ -2114,7 +2114,7 @@
     </w:p>
     <w:p>
       <w:pPr>
-        <w:pStyle w:val="Heading1"/>
+        <w:pStyle w:val="SectionTitleManual"/>
       </w:pPr>
       <w:r>
         <w:t>10. Analítica de productividad y combustible</w:t>
@@ -2294,7 +2294,7 @@
     </w:p>
     <w:p>
       <w:pPr>
-        <w:pStyle w:val="Heading1"/>
+        <w:pStyle w:val="SectionTitleManual"/>
       </w:pPr>
       <w:r>
         <w:t>11. Analítica de flota y detalle auditable</w:t>
@@ -2474,7 +2474,7 @@
     </w:p>
     <w:p>
       <w:pPr>
-        <w:pStyle w:val="Heading1"/>
+        <w:pStyle w:val="SectionTitleManual"/>
       </w:pPr>
       <w:r>
         <w:t>12. Maestros: la base de datos operacionales</w:t>
@@ -2665,7 +2665,7 @@
     </w:p>
     <w:p>
       <w:pPr>
-        <w:pStyle w:val="Heading1"/>
+        <w:pStyle w:val="SectionTitleManual"/>
       </w:pPr>
       <w:r>
         <w:t>13. Predios y polígonos</w:t>
@@ -2871,7 +2871,7 @@
     </w:p>
     <w:p>
       <w:pPr>
-        <w:pStyle w:val="Heading1"/>
+        <w:pStyle w:val="SectionTitleManual"/>
       </w:pPr>
       <w:r>
         <w:t>14. Historial y reproducción</w:t>
@@ -3062,7 +3062,7 @@
     </w:p>
     <w:p>
       <w:pPr>
-        <w:pStyle w:val="Heading1"/>
+        <w:pStyle w:val="SectionTitleManual"/>
       </w:pPr>
       <w:r>
         <w:t>15. Rutina diaria de trabajo</w:t>
@@ -3440,7 +3440,7 @@
     </w:p>
     <w:p>
       <w:pPr>
-        <w:pStyle w:val="Heading1"/>
+        <w:pStyle w:val="SectionTitleManual"/>
       </w:pPr>
       <w:r>
         <w:t>16. Cómo vender la idea</w:t>
@@ -3647,7 +3647,7 @@
     </w:p>
     <w:p>
       <w:pPr>
-        <w:pStyle w:val="Heading1"/>
+        <w:pStyle w:val="SectionTitleManual"/>
       </w:pPr>
       <w:r>
         <w:t>17. Dudas comunes y respuestas simples</w:t>
@@ -4113,7 +4113,7 @@
     </w:p>
     <w:p>
       <w:pPr>
-        <w:pStyle w:val="Heading1"/>
+        <w:pStyle w:val="SectionTitleManual"/>
       </w:pPr>
       <w:r>
         <w:t>18. La idea central</w:t>
@@ -16397,6 +16397,21 @@
       <w:b/>
       <w:color w:val="103F35"/>
       <w:sz w:val="22"/>
+    </w:rPr>
+  </w:style>
+  <w:style w:type="paragraph" w:customStyle="1" w:styleId="SectionTitleManual">
+    <w:name w:val="Section Title Manual"/>
+    <w:basedOn w:val="Normal"/>
+    <w:pPr>
+      <w:keepNext/>
+      <w:keepLines/>
+      <w:spacing w:before="360" w:after="200"/>
+    </w:pPr>
+    <w:rPr>
+      <w:rFonts w:ascii="Calibri" w:hAnsi="Calibri"/>
+      <w:b/>
+      <w:color w:val="2E74B5"/>
+      <w:sz w:val="32"/>
     </w:rPr>
   </w:style>
 </w:styles>

</xml_diff>